<commit_message>
Quantifica time de 6 desenvolvedores na Questrade
Claude-Session: https://claude.ai/code/session_016JGQGBoD8yFFdAnKSGSSqd
</commit_message>
<xml_diff>
--- a/en/Rafael Veneroso Morici - Resume.docx
+++ b/en/Rafael Veneroso Morici - Resume.docx
@@ -241,7 +241,7 @@
         <w:pStyle w:val="Commarcadores"/>
       </w:pPr>
       <w:r>
-        <w:t>Technical reference for the team: actively took part in solution architecture decisions, supported complex problem solving and led code reviews.</w:t>
+        <w:t>Technical reference within a 6-developer team: actively took part in solution architecture decisions, supported complex problem solving and led code reviews.</w:t>
       </w:r>
     </w:p>
     <w:p>
@@ -605,31 +605,31 @@
       </w:rPr>
     </w:lvl>
   </w:abstractNum>
-  <w:num w:numId="1" w16cid:durableId="462114532">
+  <w:num w:numId="1" w16cid:durableId="145515814">
     <w:abstractNumId w:val="8"/>
   </w:num>
-  <w:num w:numId="2" w16cid:durableId="551767654">
+  <w:num w:numId="2" w16cid:durableId="102965515">
     <w:abstractNumId w:val="6"/>
   </w:num>
-  <w:num w:numId="3" w16cid:durableId="1436369609">
+  <w:num w:numId="3" w16cid:durableId="341594054">
     <w:abstractNumId w:val="5"/>
   </w:num>
-  <w:num w:numId="4" w16cid:durableId="20787799">
+  <w:num w:numId="4" w16cid:durableId="524559259">
     <w:abstractNumId w:val="4"/>
   </w:num>
-  <w:num w:numId="5" w16cid:durableId="1876232691">
+  <w:num w:numId="5" w16cid:durableId="1000742458">
     <w:abstractNumId w:val="7"/>
   </w:num>
-  <w:num w:numId="6" w16cid:durableId="127478175">
+  <w:num w:numId="6" w16cid:durableId="1190607540">
     <w:abstractNumId w:val="3"/>
   </w:num>
-  <w:num w:numId="7" w16cid:durableId="1240872123">
+  <w:num w:numId="7" w16cid:durableId="554588465">
     <w:abstractNumId w:val="2"/>
   </w:num>
-  <w:num w:numId="8" w16cid:durableId="706612310">
+  <w:num w:numId="8" w16cid:durableId="1811557514">
     <w:abstractNumId w:val="1"/>
   </w:num>
-  <w:num w:numId="9" w16cid:durableId="672268902">
+  <w:num w:numId="9" w16cid:durableId="2094155551">
     <w:abstractNumId w:val="0"/>
   </w:num>
 </w:numbering>

</xml_diff>

<commit_message>
Contextualiza tempo ate virar referencia tecnica na Questrade
Claude-Session: https://claude.ai/code/session_016JGQGBoD8yFFdAnKSGSSqd
</commit_message>
<xml_diff>
--- a/en/Rafael Veneroso Morici - Resume.docx
+++ b/en/Rafael Veneroso Morici - Resume.docx
@@ -241,7 +241,7 @@
         <w:pStyle w:val="Commarcadores"/>
       </w:pPr>
       <w:r>
-        <w:t>Technical reference within a 6-developer team: actively took part in solution architecture decisions, supported complex problem solving and led code reviews.</w:t>
+        <w:t>Recognized as the technical reference of a 6-developer team — several with 10 years at the company — within the first year: actively took part in solution architecture decisions, supported complex problem solving and led code reviews.</w:t>
       </w:r>
     </w:p>
     <w:p>
@@ -605,31 +605,31 @@
       </w:rPr>
     </w:lvl>
   </w:abstractNum>
-  <w:num w:numId="1" w16cid:durableId="145515814">
+  <w:num w:numId="1" w16cid:durableId="1800298149">
     <w:abstractNumId w:val="8"/>
   </w:num>
-  <w:num w:numId="2" w16cid:durableId="102965515">
+  <w:num w:numId="2" w16cid:durableId="1740858119">
     <w:abstractNumId w:val="6"/>
   </w:num>
-  <w:num w:numId="3" w16cid:durableId="341594054">
+  <w:num w:numId="3" w16cid:durableId="1652564029">
     <w:abstractNumId w:val="5"/>
   </w:num>
-  <w:num w:numId="4" w16cid:durableId="524559259">
+  <w:num w:numId="4" w16cid:durableId="169411028">
     <w:abstractNumId w:val="4"/>
   </w:num>
-  <w:num w:numId="5" w16cid:durableId="1000742458">
+  <w:num w:numId="5" w16cid:durableId="253560226">
     <w:abstractNumId w:val="7"/>
   </w:num>
-  <w:num w:numId="6" w16cid:durableId="1190607540">
+  <w:num w:numId="6" w16cid:durableId="634289332">
     <w:abstractNumId w:val="3"/>
   </w:num>
-  <w:num w:numId="7" w16cid:durableId="554588465">
+  <w:num w:numId="7" w16cid:durableId="171336586">
     <w:abstractNumId w:val="2"/>
   </w:num>
-  <w:num w:numId="8" w16cid:durableId="1811557514">
+  <w:num w:numId="8" w16cid:durableId="994379424">
     <w:abstractNumId w:val="1"/>
   </w:num>
-  <w:num w:numId="9" w16cid:durableId="2094155551">
+  <w:num w:numId="9" w16cid:durableId="88476583">
     <w:abstractNumId w:val="0"/>
   </w:num>
 </w:numbering>

</xml_diff>

<commit_message>
Adiciona escala e contexto de negocio em Questrade, UL Solutions e EMC
- Questrade: 50+ afiliados e picos de 10 mil aberturas de conta/dia na pandemia
- UL Solutions: plataforma que substitui o legado dos grandes clientes
- EMC: ERP do zero para 100+ funcionarios apos falha de SAP e TOTVS, com modulos

Claude-Session: https://claude.ai/code/session_016JGQGBoD8yFFdAnKSGSSqd
</commit_message>
<xml_diff>
--- a/en/Rafael Veneroso Morici - Resume.docx
+++ b/en/Rafael Veneroso Morici - Resume.docx
@@ -126,7 +126,7 @@
         <w:pStyle w:val="Commarcadores"/>
       </w:pPr>
       <w:r>
-        <w:t>Develop UL Solutions' greenhouse gas (carbon footprint) calculation system in C# and .NET, exposing REST APIs consumed by the product applications.</w:t>
+        <w:t>Develop the new greenhouse gas (carbon footprint) calculation platform in C# and .NET with REST APIs, set to replace the legacy system that serves UL Solutions' enterprise clients.</w:t>
       </w:r>
     </w:p>
     <w:p>
@@ -134,7 +134,7 @@
         <w:pStyle w:val="Commarcadores"/>
       </w:pPr>
       <w:r>
-        <w:t>Model and evolve the relational database (SQL Server and PostgreSQL), including aggregation queries over large volumes of emission data.</w:t>
+        <w:t>Model and evolve the new system's relational database (SQL Server and PostgreSQL).</w:t>
       </w:r>
     </w:p>
     <w:p>
@@ -142,7 +142,7 @@
         <w:pStyle w:val="Commarcadores"/>
       </w:pPr>
       <w:r>
-        <w:t>Deploy and support services on Microsoft Azure.</w:t>
+        <w:t>Services hosted on Microsoft Azure.</w:t>
       </w:r>
     </w:p>
     <w:p>
@@ -233,7 +233,7 @@
         <w:pStyle w:val="Commarcadores"/>
       </w:pPr>
       <w:r>
-        <w:t>Developed and maintained the bank's web systems in C# and .NET on top of the Sitefinity CMS.</w:t>
+        <w:t>Developed and maintained the bank's web systems in C# and .NET on top of the Sitefinity CMS, which sustained peaks of over 10,000 account openings per day during the pandemic.</w:t>
       </w:r>
     </w:p>
     <w:p>
@@ -249,7 +249,7 @@
         <w:pStyle w:val="Commarcadores"/>
       </w:pPr>
       <w:r>
-        <w:t>Technical owner of the bank's affiliate and partner systems, including commission rules and integrations with internal systems.</w:t>
+        <w:t>Technical owner of the bank's affiliate and partner systems, covering 50+ active affiliates, including commission rules and integrations with internal systems.</w:t>
       </w:r>
     </w:p>
     <w:p>
@@ -331,7 +331,7 @@
         <w:pStyle w:val="Commarcadores"/>
       </w:pPr>
       <w:r>
-        <w:t>Developed a corporate ERP with a WPF desktop interface for internal users and Web Forms + WCF for external clients.</w:t>
+        <w:t>Built from scratch the ERP that came to run the operation of a 100+ employee company, after failed attempts to roll out SAP and TOTVS.</w:t>
       </w:r>
     </w:p>
     <w:p>
@@ -339,7 +339,7 @@
         <w:pStyle w:val="Commarcadores"/>
       </w:pPr>
       <w:r>
-        <w:t>Modeled the domain using Domain-Driven Design (DDD) and layered architecture.</w:t>
+        <w:t>Owned the domain modeling with Domain-Driven Design (DDD) and the design of the system's layered architecture.</w:t>
       </w:r>
     </w:p>
     <w:p>
@@ -347,7 +347,15 @@
         <w:pStyle w:val="Commarcadores"/>
       </w:pPr>
       <w:r>
-        <w:t>Delivered evolutive and corrective maintenance on a legacy codebase.</w:t>
+        <w:t>Delivered modules for IT equipment leasing — the company's core business —, service orders, contracts, finance and customer support.</w:t>
+      </w:r>
+    </w:p>
+    <w:p>
+      <w:pPr>
+        <w:pStyle w:val="Commarcadores"/>
+      </w:pPr>
+      <w:r>
+        <w:t>Built a WPF desktop interface for internal users and Web Forms + WCF for external clients.</w:t>
       </w:r>
     </w:p>
     <w:p>
@@ -605,31 +613,31 @@
       </w:rPr>
     </w:lvl>
   </w:abstractNum>
-  <w:num w:numId="1" w16cid:durableId="1800298149">
+  <w:num w:numId="1" w16cid:durableId="1563524368">
     <w:abstractNumId w:val="8"/>
   </w:num>
-  <w:num w:numId="2" w16cid:durableId="1740858119">
+  <w:num w:numId="2" w16cid:durableId="1930625058">
     <w:abstractNumId w:val="6"/>
   </w:num>
-  <w:num w:numId="3" w16cid:durableId="1652564029">
+  <w:num w:numId="3" w16cid:durableId="27223015">
     <w:abstractNumId w:val="5"/>
   </w:num>
-  <w:num w:numId="4" w16cid:durableId="169411028">
+  <w:num w:numId="4" w16cid:durableId="1565213896">
     <w:abstractNumId w:val="4"/>
   </w:num>
-  <w:num w:numId="5" w16cid:durableId="253560226">
+  <w:num w:numId="5" w16cid:durableId="1373455829">
     <w:abstractNumId w:val="7"/>
   </w:num>
-  <w:num w:numId="6" w16cid:durableId="634289332">
+  <w:num w:numId="6" w16cid:durableId="1326081549">
     <w:abstractNumId w:val="3"/>
   </w:num>
-  <w:num w:numId="7" w16cid:durableId="171336586">
+  <w:num w:numId="7" w16cid:durableId="71701623">
     <w:abstractNumId w:val="2"/>
   </w:num>
-  <w:num w:numId="8" w16cid:durableId="994379424">
+  <w:num w:numId="8" w16cid:durableId="2046248788">
     <w:abstractNumId w:val="1"/>
   </w:num>
-  <w:num w:numId="9" w16cid:durableId="88476583">
+  <w:num w:numId="9" w16cid:durableId="305478639">
     <w:abstractNumId w:val="0"/>
   </w:num>
 </w:numbering>

</xml_diff>

<commit_message>
Ajusta resumo para 15+ anos e detalha lideranca tecnica na Mereo
- Resumo: 15+ anos de experiencia e passagem por lideranca tecnica
- Mereo: titulo de Lider Tecnico, time de 3 devs + 1 QA, nine box e sucessao
- Nota de experiencias anteriores a 2017 sob solicitacao
- Compacta layout (fonte 10) para manter 2 paginas

Claude-Session: https://claude.ai/code/session_016JGQGBoD8yFFdAnKSGSSqd
</commit_message>
<xml_diff>
--- a/en/Rafael Veneroso Morici - Resume.docx
+++ b/en/Rafael Veneroso Morici - Resume.docx
@@ -51,10 +51,10 @@
     </w:p>
     <w:p>
       <w:r>
-        <w:t>Software engineer with 9+ years of experience in C# and .NET, building enterprise systems end to end — from domain modeling to production deployment. Serves as a technical reference within the team, contributing to architecture decisions and supporting other developers. Background in ERP, banking, people management platforms and, currently, carbon emission calculation. Hands-on with layered architecture and Domain-Driven Design (DDD), REST APIs, Blazor, SQL Server and PostgreSQL, containerization with Docke</w:t>
+        <w:t>Software engineer with 15+ years of experience building enterprise systems in C# and .NET end to end — from domain modeling to production deployment. Serves as a technical reference within the team and has led a squad as team lead, contributing to architecture decisions and supporting other developers. Background in ERP, banking, people management platforms and, currently, carbon emission calculation. Hands-on with layered architecture and Domain-Driven Design (DDD), REST APIs, Blazor, SQL Server and Postgr</w:t>
       </w:r>
       <w:r>
-        <w:t>r and CI/CD pipelines on Microsoft Azure and Google Cloud Platform. Advanced English, working daily with a distributed international team.</w:t>
+        <w:t>eSQL, containerization with Docker and CI/CD pipelines on Microsoft Azure and Google Cloud Platform. Advanced English, working daily with a distributed international team.</w:t>
       </w:r>
     </w:p>
     <w:p>
@@ -134,15 +134,7 @@
         <w:pStyle w:val="Commarcadores"/>
       </w:pPr>
       <w:r>
-        <w:t>Model and evolve the new system's relational database (SQL Server and PostgreSQL).</w:t>
-      </w:r>
-    </w:p>
-    <w:p>
-      <w:pPr>
-        <w:pStyle w:val="Commarcadores"/>
-      </w:pPr>
-      <w:r>
-        <w:t>Services hosted on Microsoft Azure.</w:t>
+        <w:t>Model and evolve the new system's relational database (SQL Server and PostgreSQL), with services hosted on Microsoft Azure.</w:t>
       </w:r>
     </w:p>
     <w:p>
@@ -187,7 +179,6 @@
         <w:pStyle w:val="Commarcadores"/>
       </w:pPr>
       <w:r>
-        <w:lastRenderedPageBreak/>
         <w:t>Payments service: Pix, bank slip and credit card billing, abstracting multiple providers (Asaas and Inter), with per-application data isolation via API Key and signed webhooks.</w:t>
       </w:r>
     </w:p>
@@ -212,6 +203,7 @@
         <w:pStyle w:val="Commarcadores"/>
       </w:pPr>
       <w:r>
+        <w:lastRenderedPageBreak/>
         <w:t>Used AI agents as an engineering tool across the whole cycle: specification, implementation, code review and deployment.</w:t>
       </w:r>
     </w:p>
@@ -265,15 +257,7 @@
         <w:pStyle w:val="Commarcadores"/>
       </w:pPr>
       <w:r>
-        <w:t>Worked in a regulated financial environment with security, traceability and audit requirements.</w:t>
-      </w:r>
-    </w:p>
-    <w:p>
-      <w:pPr>
-        <w:pStyle w:val="Commarcadores"/>
-      </w:pPr>
-      <w:r>
-        <w:t>Daily communication in English with the team and business stakeholders in Canada.</w:t>
+        <w:t>Worked in a regulated financial environment — security, traceability and audit requirements —, communicating daily in English with the team and business stakeholders in Canada.</w:t>
       </w:r>
     </w:p>
     <w:p>
@@ -286,7 +270,7 @@
     </w:p>
     <w:p>
       <w:r>
-        <w:t>Senior Software Developer | Jul 2018 – Jun 2019</w:t>
+        <w:t>Senior Software Developer / Team Lead | Jul 2018 – Jun 2019</w:t>
       </w:r>
     </w:p>
     <w:p>
@@ -294,7 +278,23 @@
         <w:pStyle w:val="Commarcadores"/>
       </w:pPr>
       <w:r>
-        <w:t>Developed a SaaS people and performance management platform in C# with ASP.NET and an Angular 2 front end.</w:t>
+        <w:t>Led a team of 3 developers and 1 QA responsible for the performance review module of a SaaS HR management platform.</w:t>
+      </w:r>
+    </w:p>
+    <w:p>
+      <w:pPr>
+        <w:pStyle w:val="Commarcadores"/>
+      </w:pPr>
+      <w:r>
+        <w:t>Built the employee assessment features: nine box matrix and succession planning for key positions.</w:t>
+      </w:r>
+    </w:p>
+    <w:p>
+      <w:pPr>
+        <w:pStyle w:val="Commarcadores"/>
+      </w:pPr>
+      <w:r>
+        <w:t>Platform in C# with ASP.NET and an Angular 2 front end, with REST APIs consumed by the web application.</w:t>
       </w:r>
     </w:p>
     <w:p>
@@ -303,14 +303,6 @@
       </w:pPr>
       <w:r>
         <w:t>Modeled and optimized the SQL Server database.</w:t>
-      </w:r>
-    </w:p>
-    <w:p>
-      <w:pPr>
-        <w:pStyle w:val="Commarcadores"/>
-      </w:pPr>
-      <w:r>
-        <w:t>Built REST APIs consumed by the web application.</w:t>
       </w:r>
     </w:p>
     <w:p>
@@ -356,6 +348,11 @@
       </w:pPr>
       <w:r>
         <w:t>Built a WPF desktop interface for internal users and Web Forms + WCF for external clients.</w:t>
+      </w:r>
+    </w:p>
+    <w:p>
+      <w:r>
+        <w:t>Experience prior to 2017 available upon request.</w:t>
       </w:r>
     </w:p>
     <w:p>
@@ -613,31 +610,31 @@
       </w:rPr>
     </w:lvl>
   </w:abstractNum>
-  <w:num w:numId="1" w16cid:durableId="1563524368">
+  <w:num w:numId="1" w16cid:durableId="1831212419">
     <w:abstractNumId w:val="8"/>
   </w:num>
-  <w:num w:numId="2" w16cid:durableId="1930625058">
+  <w:num w:numId="2" w16cid:durableId="233705569">
     <w:abstractNumId w:val="6"/>
   </w:num>
-  <w:num w:numId="3" w16cid:durableId="27223015">
+  <w:num w:numId="3" w16cid:durableId="843514096">
     <w:abstractNumId w:val="5"/>
   </w:num>
-  <w:num w:numId="4" w16cid:durableId="1565213896">
+  <w:num w:numId="4" w16cid:durableId="849833660">
     <w:abstractNumId w:val="4"/>
   </w:num>
-  <w:num w:numId="5" w16cid:durableId="1373455829">
+  <w:num w:numId="5" w16cid:durableId="726302629">
     <w:abstractNumId w:val="7"/>
   </w:num>
-  <w:num w:numId="6" w16cid:durableId="1326081549">
+  <w:num w:numId="6" w16cid:durableId="1894466495">
     <w:abstractNumId w:val="3"/>
   </w:num>
-  <w:num w:numId="7" w16cid:durableId="71701623">
+  <w:num w:numId="7" w16cid:durableId="994187077">
     <w:abstractNumId w:val="2"/>
   </w:num>
-  <w:num w:numId="8" w16cid:durableId="2046248788">
+  <w:num w:numId="8" w16cid:durableId="148638577">
     <w:abstractNumId w:val="1"/>
   </w:num>
-  <w:num w:numId="9" w16cid:durableId="305478639">
+  <w:num w:numId="9" w16cid:durableId="695693026">
     <w:abstractNumId w:val="0"/>
   </w:num>
 </w:numbering>
@@ -1038,7 +1035,7 @@
     </w:pPr>
     <w:rPr>
       <w:rFonts w:ascii="Calibri" w:hAnsi="Calibri"/>
-      <w:sz w:val="21"/>
+      <w:sz w:val="20"/>
     </w:rPr>
   </w:style>
   <w:style w:type="paragraph" w:styleId="Ttulo1">
@@ -1076,7 +1073,7 @@
     <w:pPr>
       <w:keepNext/>
       <w:keepLines/>
-      <w:spacing w:before="200" w:after="40"/>
+      <w:spacing w:before="160" w:after="40"/>
       <w:outlineLvl w:val="1"/>
     </w:pPr>
     <w:rPr>
@@ -1084,7 +1081,7 @@
       <w:b/>
       <w:bCs/>
       <w:color w:val="1F1F1F"/>
-      <w:sz w:val="25"/>
+      <w:sz w:val="24"/>
       <w:szCs w:val="26"/>
     </w:rPr>
   </w:style>
@@ -1221,7 +1218,6 @@
     <w:rPr>
       <w:rFonts w:asciiTheme="majorHAnsi" w:eastAsiaTheme="majorEastAsia" w:hAnsiTheme="majorHAnsi" w:cstheme="majorBidi"/>
       <w:color w:val="4F81BD" w:themeColor="accent1"/>
-      <w:sz w:val="20"/>
       <w:szCs w:val="20"/>
     </w:rPr>
   </w:style>
@@ -1246,7 +1242,6 @@
       <w:i/>
       <w:iCs/>
       <w:color w:val="404040" w:themeColor="text1" w:themeTint="BF"/>
-      <w:sz w:val="20"/>
       <w:szCs w:val="20"/>
     </w:rPr>
   </w:style>

</xml_diff>

<commit_message>
Adiciona Vertical Slice Architecture (VSA) ao resumo, competencias e projetos
Claude-Session: https://claude.ai/code/session_016JGQGBoD8yFFdAnKSGSSqd
</commit_message>
<xml_diff>
--- a/en/Rafael Veneroso Morici - Resume.docx
+++ b/en/Rafael Veneroso Morici - Resume.docx
@@ -51,10 +51,10 @@
     </w:p>
     <w:p>
       <w:r>
-        <w:t>Software engineer with 15+ years of experience building enterprise systems in C# and .NET end to end — from domain modeling to production deployment. Serves as a technical reference within the team and has led a squad as team lead, contributing to architecture decisions and supporting other developers. Background in ERP, banking, people management platforms and, currently, carbon emission calculation. Hands-on with layered architecture and Domain-Driven Design (DDD), REST APIs, Blazor, SQL Server and Postgr</w:t>
+        <w:t xml:space="preserve">Software engineer with 15+ years of experience building enterprise systems in C# and .NET end to end — from domain modeling to production deployment. Serves as a technical reference within the team and has led a squad as team lead, contributing to architecture decisions and supporting other developers. Background in ERP, banking, people management platforms and, currently, carbon emission calculation. Hands-on with Vertical Slice Architecture (VSA), layered architecture and Domain-Driven Design (DDD), REST </w:t>
       </w:r>
       <w:r>
-        <w:t>eSQL, containerization with Docker and CI/CD pipelines on Microsoft Azure and Google Cloud Platform. Advanced English, working daily with a distributed international team.</w:t>
+        <w:t>APIs, Blazor, SQL Server and PostgreSQL, containerization with Docker and CI/CD pipelines on Microsoft Azure and Google Cloud Platform. Advanced English, working daily with a distributed international team.</w:t>
       </w:r>
     </w:p>
     <w:p>
@@ -72,7 +72,7 @@
     </w:p>
     <w:p>
       <w:r>
-        <w:t>Architecture: Domain-Driven Design (DDD), layered architecture, REST APIs, system integration, multi-tenant services, authentication and authorization (OAuth 2.0 / OpenID Connect)</w:t>
+        <w:t>Architecture: Vertical Slice Architecture (VSA), Domain-Driven Design (DDD), layered architecture, REST APIs, system integration, multi-tenant services, authentication and authorization (OAuth 2.0 / OpenID Connect)</w:t>
       </w:r>
     </w:p>
     <w:p>
@@ -163,7 +163,7 @@
         <w:pStyle w:val="Commarcadores"/>
       </w:pPr>
       <w:r>
-        <w:t>Designed and built, from scratch to production, an ecosystem of applications on .NET 10, Blazor Server, Entity Framework Core and PostgreSQL, deployed to a Linux VPS with Docker, Nginx and SSL.</w:t>
+        <w:t>Designed and built, from scratch to production, an ecosystem of applications using Vertical Slice Architecture (VSA), on .NET 10, Blazor Server, Entity Framework Core and PostgreSQL, deployed to a Linux VPS with Docker, Nginx and SSL.</w:t>
       </w:r>
     </w:p>
     <w:p>
@@ -195,6 +195,7 @@
         <w:pStyle w:val="Commarcadores"/>
       </w:pPr>
       <w:r>
+        <w:lastRenderedPageBreak/>
         <w:t>CI/CD pipelines with GitHub Actions and segregated development, staging and production environments.</w:t>
       </w:r>
     </w:p>
@@ -203,7 +204,6 @@
         <w:pStyle w:val="Commarcadores"/>
       </w:pPr>
       <w:r>
-        <w:lastRenderedPageBreak/>
         <w:t>Used AI agents as an engineering tool across the whole cycle: specification, implementation, code review and deployment.</w:t>
       </w:r>
     </w:p>
@@ -610,31 +610,31 @@
       </w:rPr>
     </w:lvl>
   </w:abstractNum>
-  <w:num w:numId="1" w16cid:durableId="1831212419">
+  <w:num w:numId="1" w16cid:durableId="2080323812">
     <w:abstractNumId w:val="8"/>
   </w:num>
-  <w:num w:numId="2" w16cid:durableId="233705569">
+  <w:num w:numId="2" w16cid:durableId="530143367">
     <w:abstractNumId w:val="6"/>
   </w:num>
-  <w:num w:numId="3" w16cid:durableId="843514096">
+  <w:num w:numId="3" w16cid:durableId="1877085896">
     <w:abstractNumId w:val="5"/>
   </w:num>
-  <w:num w:numId="4" w16cid:durableId="849833660">
+  <w:num w:numId="4" w16cid:durableId="1445611954">
     <w:abstractNumId w:val="4"/>
   </w:num>
-  <w:num w:numId="5" w16cid:durableId="726302629">
+  <w:num w:numId="5" w16cid:durableId="909313411">
     <w:abstractNumId w:val="7"/>
   </w:num>
-  <w:num w:numId="6" w16cid:durableId="1894466495">
+  <w:num w:numId="6" w16cid:durableId="1471358629">
     <w:abstractNumId w:val="3"/>
   </w:num>
-  <w:num w:numId="7" w16cid:durableId="994187077">
+  <w:num w:numId="7" w16cid:durableId="375857978">
     <w:abstractNumId w:val="2"/>
   </w:num>
-  <w:num w:numId="8" w16cid:durableId="148638577">
+  <w:num w:numId="8" w16cid:durableId="1231424156">
     <w:abstractNumId w:val="1"/>
   </w:num>
-  <w:num w:numId="9" w16cid:durableId="695693026">
+  <w:num w:numId="9" w16cid:durableId="1105343041">
     <w:abstractNumId w:val="0"/>
   </w:num>
 </w:numbering>

</xml_diff>

<commit_message>
Adiciona o link do curriculo online no cabecalho (TASK-831)
Claude-Session: https://claude.ai/code/session_016JGQGBoD8yFFdAnKSGSSqd
</commit_message>
<xml_diff>
--- a/en/Rafael Veneroso Morici - Resume.docx
+++ b/en/Rafael Veneroso Morici - Resume.docx
@@ -29,6 +29,11 @@
     <w:p>
       <w:r>
         <w:t>Email: rvenerosomorici@gmail.com</w:t>
+      </w:r>
+    </w:p>
+    <w:p>
+      <w:r>
+        <w:t>Online resume: rvmtech.com.br/en</w:t>
       </w:r>
     </w:p>
     <w:p>
@@ -187,6 +192,7 @@
         <w:pStyle w:val="Commarcadores"/>
       </w:pPr>
       <w:r>
+        <w:lastRenderedPageBreak/>
         <w:t>Centralized identity service (authentication and authorization) consumed by every application in the ecosystem.</w:t>
       </w:r>
     </w:p>
@@ -195,7 +201,6 @@
         <w:pStyle w:val="Commarcadores"/>
       </w:pPr>
       <w:r>
-        <w:lastRenderedPageBreak/>
         <w:t>CI/CD pipelines with GitHub Actions and segregated development, staging and production environments.</w:t>
       </w:r>
     </w:p>
@@ -610,31 +615,31 @@
       </w:rPr>
     </w:lvl>
   </w:abstractNum>
-  <w:num w:numId="1" w16cid:durableId="2080323812">
+  <w:num w:numId="1" w16cid:durableId="164831805">
     <w:abstractNumId w:val="8"/>
   </w:num>
-  <w:num w:numId="2" w16cid:durableId="530143367">
+  <w:num w:numId="2" w16cid:durableId="1537233244">
     <w:abstractNumId w:val="6"/>
   </w:num>
-  <w:num w:numId="3" w16cid:durableId="1877085896">
+  <w:num w:numId="3" w16cid:durableId="256443941">
     <w:abstractNumId w:val="5"/>
   </w:num>
-  <w:num w:numId="4" w16cid:durableId="1445611954">
+  <w:num w:numId="4" w16cid:durableId="1697268639">
     <w:abstractNumId w:val="4"/>
   </w:num>
-  <w:num w:numId="5" w16cid:durableId="909313411">
+  <w:num w:numId="5" w16cid:durableId="324356006">
     <w:abstractNumId w:val="7"/>
   </w:num>
-  <w:num w:numId="6" w16cid:durableId="1471358629">
+  <w:num w:numId="6" w16cid:durableId="1332028062">
     <w:abstractNumId w:val="3"/>
   </w:num>
-  <w:num w:numId="7" w16cid:durableId="375857978">
+  <w:num w:numId="7" w16cid:durableId="1075783827">
     <w:abstractNumId w:val="2"/>
   </w:num>
-  <w:num w:numId="8" w16cid:durableId="1231424156">
+  <w:num w:numId="8" w16cid:durableId="2064327262">
     <w:abstractNumId w:val="1"/>
   </w:num>
-  <w:num w:numId="9" w16cid:durableId="1105343041">
+  <w:num w:numId="9" w16cid:durableId="228853398">
     <w:abstractNumId w:val="0"/>
   </w:num>
 </w:numbering>

</xml_diff>